<commit_message>
Regenerate abdomen-pelvis topics, TOC, and fix embeds/MCQ formatting
</commit_message>
<xml_diff>
--- a/www/content/abdomen-pelvis/Jejunum and ileum.docx
+++ b/www/content/abdomen-pelvis/Jejunum and ileum.docx
@@ -32,55 +32,48 @@
     </w:p>
     <w:p>
       <w:r>
-        <w:t xml:space="preserve">Suspended in the abdomen through the </w:t>
-      </w:r>
-      <w:proofErr w:type="spellStart"/>
-      <w:r>
-        <w:t>mesetery</w:t>
-      </w:r>
-      <w:proofErr w:type="spellEnd"/>
-    </w:p>
-    <w:p>
-      <w:pPr>
-        <w:pStyle w:val="Heading1"/>
+        <w:t>Suspended in the abdomen through the mesetery</w:t>
+      </w:r>
+    </w:p>
+    <w:p>
+      <w:pPr>
+        <w:pStyle w:val="Heading2"/>
       </w:pPr>
       <w:r>
         <w:t>Blood supply</w:t>
       </w:r>
     </w:p>
     <w:p>
+      <w:r>
+        <w:t xml:space="preserve">Arterial supply </w:t>
+      </w:r>
+    </w:p>
+    <w:p>
+      <w:pPr>
+        <w:pBdr>
+          <w:bottom w:val="single" w:sz="12" w:space="1" w:color="auto"/>
+        </w:pBdr>
+      </w:pPr>
+      <w:r>
+        <w:t xml:space="preserve">By jejunal and ileal branches of superior mesenteric artery </w:t>
+      </w:r>
+    </w:p>
+    <w:p>
+      <w:r>
+        <w:t xml:space="preserve">Venous drainage </w:t>
+      </w:r>
+    </w:p>
+    <w:p>
+      <w:r>
+        <w:t>By corresponding veins drain to superior mesenteric vein (portal vein)</w:t>
+      </w:r>
+    </w:p>
+    <w:p/>
+    <w:p>
       <w:pPr>
         <w:pStyle w:val="Heading2"/>
       </w:pPr>
       <w:r>
-        <w:t xml:space="preserve">Arterial supply </w:t>
-      </w:r>
-    </w:p>
-    <w:p>
-      <w:r>
-        <w:t xml:space="preserve">By jejunal and ileal branches of superior mesenteric artery </w:t>
-      </w:r>
-    </w:p>
-    <w:p/>
-    <w:p>
-      <w:pPr>
-        <w:pStyle w:val="Heading2"/>
-      </w:pPr>
-      <w:r>
-        <w:t xml:space="preserve">Venous drainage </w:t>
-      </w:r>
-    </w:p>
-    <w:p>
-      <w:r>
-        <w:t>By corresponding veins drain to superior mesenteric vein (portal vein)</w:t>
-      </w:r>
-    </w:p>
-    <w:p/>
-    <w:p>
-      <w:pPr>
-        <w:pStyle w:val="Heading1"/>
-      </w:pPr>
-      <w:r>
         <w:t>Lymphatic drainage</w:t>
       </w:r>
     </w:p>
@@ -91,18 +84,21 @@
     </w:p>
     <w:p>
       <w:r>
-        <w:t xml:space="preserve">Later the lymph enters cisterna chyli to drain into </w:t>
-      </w:r>
-      <w:proofErr w:type="spellStart"/>
-      <w:r>
-        <w:t>throcic</w:t>
-      </w:r>
-      <w:proofErr w:type="spellEnd"/>
-      <w:r>
-        <w:t xml:space="preserve"> duct </w:t>
-      </w:r>
-    </w:p>
-    <w:p/>
+        <w:t>Later the lymph enters cisterna chyli to drain into th</w:t>
+      </w:r>
+      <w:r>
+        <w:t>o</w:t>
+      </w:r>
+      <w:r>
+        <w:t>r</w:t>
+      </w:r>
+      <w:r>
+        <w:t>a</w:t>
+      </w:r>
+      <w:r>
+        <w:t>cic duct </w:t>
+      </w:r>
+    </w:p>
     <w:p>
       <w:r>
         <w:t>Lymphatics of small intestine carries major portion absorbed lipids </w:t>
@@ -125,7 +121,7 @@
     </w:p>
     <w:p>
       <w:pPr>
-        <w:pStyle w:val="Heading1"/>
+        <w:pStyle w:val="Heading2"/>
       </w:pPr>
       <w:r>
         <w:t>Innervation</w:t>
@@ -145,103 +141,62 @@
         <w:rPr>
           <w:rStyle w:val="Heading2Char"/>
         </w:rPr>
-        <w:t>b</w:t>
-      </w:r>
-      <w:r>
-        <w:rPr>
-          <w:rStyle w:val="Heading2Char"/>
-        </w:rPr>
-        <w:t xml:space="preserve">y </w:t>
-      </w:r>
-      <w:proofErr w:type="spellStart"/>
-      <w:r>
-        <w:rPr>
-          <w:rStyle w:val="Heading2Char"/>
-        </w:rPr>
-        <w:t>vagus</w:t>
-      </w:r>
-      <w:proofErr w:type="spellEnd"/>
-      <w:r>
-        <w:rPr>
-          <w:rStyle w:val="Heading2Char"/>
-        </w:rPr>
-        <w:t xml:space="preserve"> nerve</w:t>
-      </w:r>
-    </w:p>
-    <w:p>
-      <w:pPr>
-        <w:numPr>
-          <w:ilvl w:val="0"/>
-          <w:numId w:val="2"/>
-        </w:numPr>
-      </w:pPr>
+        <w:t>by vagus nerve</w:t>
+      </w:r>
+    </w:p>
+    <w:p>
       <w:r>
         <w:t>Secretion of glands and motility</w:t>
       </w:r>
     </w:p>
     <w:p>
+      <w:r>
+        <w:t>Sympathetic supply - splanchnic nerves </w:t>
+      </w:r>
+    </w:p>
+    <w:p>
+      <w:r>
+        <w:t>Controls blood supply to the gut, also influences motility and glandular secretions</w:t>
+      </w:r>
+    </w:p>
+    <w:p>
       <w:pPr>
         <w:pStyle w:val="Heading2"/>
       </w:pPr>
       <w:r>
-        <w:t>Sympathetic supply - splanchnic nerves </w:t>
-      </w:r>
-    </w:p>
-    <w:p>
-      <w:pPr>
-        <w:numPr>
-          <w:ilvl w:val="0"/>
-          <w:numId w:val="3"/>
-        </w:numPr>
-      </w:pPr>
-      <w:r>
-        <w:t>Controls blood supply to the gut, also influences motility and glandular secretions</w:t>
-      </w:r>
-    </w:p>
-    <w:p>
-      <w:pPr>
-        <w:pStyle w:val="Heading1"/>
-      </w:pPr>
+        <w:t>Functions</w:t>
+      </w:r>
+    </w:p>
+    <w:p>
+      <w:r>
+        <w:t xml:space="preserve">Jejunum </w:t>
+      </w:r>
+    </w:p>
+    <w:p>
+      <w:r>
+        <w:t xml:space="preserve">Absorb sugars, amino acids and fatty acids </w:t>
+      </w:r>
+    </w:p>
+    <w:p>
+      <w:r>
+        <w:t xml:space="preserve">Ileum </w:t>
+      </w:r>
+    </w:p>
+    <w:p>
       <w:r>
         <w:lastRenderedPageBreak/>
-        <w:t>Functions</w:t>
-      </w:r>
-    </w:p>
+        <w:t>Absorbs particularly absorbs Vitamin B12 and bile acids</w:t>
+      </w:r>
+    </w:p>
+    <w:p>
+      <w:r>
+        <w:t>Also absorbs sugars, amino acids and fatty acids</w:t>
+      </w:r>
+    </w:p>
+    <w:p/>
     <w:p>
       <w:pPr>
         <w:pStyle w:val="Heading2"/>
-      </w:pPr>
-      <w:r>
-        <w:t xml:space="preserve">Jejunum </w:t>
-      </w:r>
-    </w:p>
-    <w:p>
-      <w:r>
-        <w:t xml:space="preserve">Absorb sugars, amino acids and fatty acids </w:t>
-      </w:r>
-    </w:p>
-    <w:p>
-      <w:pPr>
-        <w:pStyle w:val="Heading2"/>
-      </w:pPr>
-      <w:r>
-        <w:t xml:space="preserve">Ileum </w:t>
-      </w:r>
-    </w:p>
-    <w:p>
-      <w:r>
-        <w:t>Absorbs particularly absorbs Vitamin B12 and bile acids</w:t>
-      </w:r>
-    </w:p>
-    <w:p>
-      <w:r>
-        <w:t>Also absorbs sugars, amino acids and fatty acids</w:t>
-      </w:r>
-    </w:p>
-    <w:p/>
-    <w:p>
-      <w:pPr>
-        <w:pStyle w:val="Heading1"/>
       </w:pPr>
       <w:r>
         <w:t>Difference between jejunum and ileum</w:t>
@@ -253,9 +208,9 @@
           <w:noProof/>
         </w:rPr>
         <w:drawing>
-          <wp:inline distT="0" distB="0" distL="0" distR="0" wp14:anchorId="2E357E0E" wp14:editId="4C0DA8DB">
-            <wp:extent cx="5731510" cy="3223895"/>
-            <wp:effectExtent l="0" t="0" r="2540" b="0"/>
+          <wp:inline distT="0" distB="0" distL="0" distR="0" wp14:anchorId="2E357E0E" wp14:editId="2A6C37FB">
+            <wp:extent cx="5731510" cy="2678724"/>
+            <wp:effectExtent l="0" t="0" r="2540" b="7620"/>
             <wp:docPr id="1630215255" name="Picture 1"/>
             <wp:cNvGraphicFramePr>
               <a:graphicFrameLocks xmlns:a="http://schemas.openxmlformats.org/drawingml/2006/main" noChangeAspect="1"/>
@@ -285,7 +240,7 @@
                   <pic:spPr bwMode="auto">
                     <a:xfrm>
                       <a:off x="0" y="0"/>
-                      <a:ext cx="5731510" cy="3223895"/>
+                      <a:ext cx="5745458" cy="2685243"/>
                     </a:xfrm>
                     <a:prstGeom prst="rect">
                       <a:avLst/>
@@ -304,9 +259,9 @@
     </w:p>
     <w:p/>
     <w:p>
-      <w:pPr>
-        <w:pStyle w:val="Heading1"/>
-      </w:pPr>
+      <w:r>
+        <w:t>[CLINICAL]</w:t>
+      </w:r>
       <w:r>
         <w:t>Capsule endoscopy</w:t>
       </w:r>
@@ -1237,7 +1192,6 @@
     <w:next w:val="Normal"/>
     <w:link w:val="Heading3Char"/>
     <w:uiPriority w:val="9"/>
-    <w:semiHidden/>
     <w:unhideWhenUsed/>
     <w:qFormat/>
     <w:rsid w:val="009E03F9"/>
@@ -1389,6 +1343,7 @@
   <w:style w:type="character" w:default="1" w:styleId="DefaultParagraphFont">
     <w:name w:val="Default Paragraph Font"/>
     <w:uiPriority w:val="1"/>
+    <w:semiHidden/>
     <w:unhideWhenUsed/>
   </w:style>
   <w:style w:type="table" w:default="1" w:styleId="TableNormal">
@@ -1443,7 +1398,6 @@
     <w:basedOn w:val="DefaultParagraphFont"/>
     <w:link w:val="Heading3"/>
     <w:uiPriority w:val="9"/>
-    <w:semiHidden/>
     <w:rsid w:val="009E03F9"/>
     <w:rPr>
       <w:rFonts w:eastAsiaTheme="majorEastAsia" w:cstheme="majorBidi"/>

</xml_diff>